<commit_message>
Insert previously added programm methods and source list into base programm file
</commit_message>
<xml_diff>
--- a/РПД_Технологии_разработки_ПО.docx
+++ b/РПД_Технологии_разработки_ПО.docx
@@ -8106,6 +8106,627 @@
       </w:pPr>
       <w:r>
         <w:t>Политика использования средств ИИ встроена в дисциплину содержательно: индикатор SS-2.1 включает постановку задач ИИ-агентам и фиксацию критериев качества их результатов, поэтому применение ИИ-инструментов в проекте не запрещается, а регламентируется — команды документируют сценарии использования ИИ, а на защите каждый участник отвечает на вопросы по коду независимо от способа его создания. Рефераты и эссе в качестве КИМ не используются; вся самостоятельная работа порождает проверяемые артефакты в репозитории проекта. Соответствие уровней КРМ (Б / С / П) и балльной шкалы будет задано отдельной таблицей в модели измерения ФОС.</w:t>
+      </w:r>
+    </w:p>
+    <w:p>
+      <w:pPr>
+        <w:pStyle w:val="1"/>
+        <w:spacing w:before="240" w:after="160"/>
+      </w:pPr>
+      <w:r>
+        <w:rPr>
+          <w:rFonts w:ascii="Times New Roman" w:hAnsi="Times New Roman"/>
+          <w:b/>
+          <w:color w:val="000000"/>
+          <w:sz w:val="30"/>
+        </w:rPr>
+        <w:t>8. Перечень основной и дополнительной учебной литературы, необходимой для освоения дисциплины</w:t>
+      </w:r>
+    </w:p>
+    <w:p>
+      <w:pPr>
+        <w:spacing w:line="360" w:lineRule="auto" w:after="120"/>
+        <w:ind w:firstLine="709"/>
+        <w:jc w:val="both"/>
+      </w:pPr>
+      <w:r>
+        <w:rPr>
+          <w:rFonts w:ascii="Times New Roman" w:hAnsi="Times New Roman"/>
+          <w:sz w:val="28"/>
+        </w:rPr>
+        <w:t>Основная литература:</w:t>
+      </w:r>
+    </w:p>
+    <w:p>
+      <w:pPr>
+        <w:spacing w:line="360" w:lineRule="auto" w:after="120"/>
+        <w:ind w:firstLine="709"/>
+        <w:jc w:val="both"/>
+      </w:pPr>
+      <w:r>
+        <w:rPr>
+          <w:rFonts w:ascii="Times New Roman" w:hAnsi="Times New Roman"/>
+          <w:sz w:val="28"/>
+        </w:rPr>
+        <w:t>1. Долженко, А. И. Технологии командной разработки программного обеспечения информационных систем / А. И. Долженко. – Москва: Интернет-Университет Информационных Технологий (ИНТУИТ), 2016. – 300 с. – EDN VRSVKH.</w:t>
+      </w:r>
+    </w:p>
+    <w:p>
+      <w:pPr>
+        <w:spacing w:line="360" w:lineRule="auto" w:after="120"/>
+        <w:ind w:firstLine="709"/>
+        <w:jc w:val="both"/>
+      </w:pPr>
+      <w:r>
+        <w:rPr>
+          <w:rFonts w:ascii="Times New Roman" w:hAnsi="Times New Roman"/>
+          <w:sz w:val="28"/>
+        </w:rPr>
+        <w:t>2. Кислицын, Е. В. Современные технологии разработки программного обеспечения / Е. В. Кислицын, М. А. Панов. – Екатеринбург: Уральский государственный экономический университет, 2021. – 176 с. – EDN ZIIADF.</w:t>
+      </w:r>
+    </w:p>
+    <w:p>
+      <w:pPr>
+        <w:spacing w:line="360" w:lineRule="auto" w:after="120"/>
+        <w:ind w:firstLine="709"/>
+        <w:jc w:val="both"/>
+      </w:pPr>
+      <w:r>
+        <w:rPr>
+          <w:rFonts w:ascii="Times New Roman" w:hAnsi="Times New Roman"/>
+          <w:sz w:val="28"/>
+        </w:rPr>
+        <w:t>3. Проектирование информационных систем: учебник и практикум для вузов / Д. В. Чистов, П. П. Мельников, А. В. Золотарюк, Н. Б. Ничепорук; под общей редакцией Д. В. Чистова. — 2-е изд., перераб. и доп. — Москва: Юрайт, 2023. — 293 с. — (Высшее образование). — ЭБС Юрайт. — URL: https://urait.ru/bcode/510287 (дата обращения: 19.04.2023). — Текст: электронный.</w:t>
+      </w:r>
+    </w:p>
+    <w:p>
+      <w:pPr>
+        <w:spacing w:line="360" w:lineRule="auto" w:after="120"/>
+        <w:ind w:firstLine="709"/>
+        <w:jc w:val="both"/>
+      </w:pPr>
+      <w:r>
+        <w:rPr>
+          <w:rFonts w:ascii="Times New Roman" w:hAnsi="Times New Roman"/>
+          <w:sz w:val="28"/>
+        </w:rPr>
+        <w:t>4. Григорьев, М. В. Проектирование информационных систем: учебное пособие для вузов / М. В. Григорьев, И. И. Григорьева. — Москва: Юрайт, 2022. — 318 с. — (Высшее образование). — ЭБС Юрайт. — URL: https://urait.ru/bcode/490725 (дата обращения: 19.04.2023). – Текст: электронный.</w:t>
+      </w:r>
+    </w:p>
+    <w:p>
+      <w:pPr>
+        <w:spacing w:line="360" w:lineRule="auto" w:after="120"/>
+        <w:ind w:firstLine="709"/>
+        <w:jc w:val="both"/>
+      </w:pPr>
+      <w:r>
+        <w:rPr>
+          <w:rFonts w:ascii="Times New Roman" w:hAnsi="Times New Roman"/>
+          <w:sz w:val="28"/>
+        </w:rPr>
+        <w:t>Дополнительная литература:</w:t>
+      </w:r>
+    </w:p>
+    <w:p>
+      <w:pPr>
+        <w:spacing w:line="360" w:lineRule="auto" w:after="120"/>
+        <w:ind w:firstLine="709"/>
+        <w:jc w:val="both"/>
+      </w:pPr>
+      <w:r>
+        <w:rPr>
+          <w:rFonts w:ascii="Times New Roman" w:hAnsi="Times New Roman"/>
+          <w:sz w:val="28"/>
+        </w:rPr>
+        <w:t>1. Долганова, О. И. Моделирование бизнес-процессов: учебник и практикум для вузов / О. И. Долганова, Е. В. Виноградова, А. М. Лобанова; под редакцией О. И. Долгановой. — Москва: Юрайт, 2023. — 289 с. — ЭБС Юрайт. — URL: https://urait.ru/bcode/511418 (дата обращения: 19.04.2023). — Текст: электронный.</w:t>
+      </w:r>
+    </w:p>
+    <w:p>
+      <w:pPr>
+        <w:spacing w:line="360" w:lineRule="auto" w:after="120"/>
+        <w:ind w:firstLine="709"/>
+        <w:jc w:val="both"/>
+      </w:pPr>
+      <w:r>
+        <w:rPr>
+          <w:rFonts w:ascii="Times New Roman" w:hAnsi="Times New Roman"/>
+          <w:sz w:val="28"/>
+        </w:rPr>
+        <w:t>2. Трещев, И. А. Обратная разработка программного обеспечения / И. А. Трещев, А. А. Обласов, Е. А. Филенко. – Комсомольск-на-Амуре: Комсомольский-на-Амуре государственный университет, 2025. – 91 с. – ISBN 978-5-7765-1604-7. – EDN CVIJSA.</w:t>
+      </w:r>
+    </w:p>
+    <w:p>
+      <w:pPr>
+        <w:spacing w:line="360" w:lineRule="auto" w:after="120"/>
+        <w:ind w:firstLine="709"/>
+        <w:jc w:val="both"/>
+      </w:pPr>
+      <w:r>
+        <w:rPr>
+          <w:rFonts w:ascii="Times New Roman" w:hAnsi="Times New Roman"/>
+          <w:sz w:val="28"/>
+        </w:rPr>
+        <w:t>3. Андреев, А. Е. Адаптивные технологии разработки программного обеспечения: Учебное пособие / А. Е. Андреев, С. И. Кирносенко. – Волгоград: Волгоградский государственный технический университет, 2015. – 96 с. – ISBN 978-5-9948-1979-1. – EDN VIAPHD.</w:t>
+      </w:r>
+    </w:p>
+    <w:p>
+      <w:pPr>
+        <w:spacing w:line="360" w:lineRule="auto" w:after="120"/>
+        <w:ind w:firstLine="709"/>
+        <w:jc w:val="both"/>
+      </w:pPr>
+      <w:r>
+        <w:rPr>
+          <w:rFonts w:ascii="Times New Roman" w:hAnsi="Times New Roman"/>
+          <w:sz w:val="28"/>
+        </w:rPr>
+        <w:t>4. Сергушичева, А. П. Технологии разработки программного обеспечения: Учебное пособие / А. П. Сергушичева. – Вологда: Вологодский государственный университет, 2019. – 92 с. – ISBN 978-5-87851-839-0. – EDN XHNURK.</w:t>
+      </w:r>
+    </w:p>
+    <w:p>
+      <w:pPr>
+        <w:spacing w:line="360" w:lineRule="auto" w:after="120"/>
+        <w:ind w:firstLine="709"/>
+        <w:jc w:val="both"/>
+      </w:pPr>
+      <w:r>
+        <w:rPr>
+          <w:rFonts w:ascii="Times New Roman" w:hAnsi="Times New Roman"/>
+          <w:sz w:val="28"/>
+        </w:rPr>
+        <w:t>5. Дробинцев, П. Д. Индустриальные технологии разработки программного обеспечения / П. Д. Дробинцев, О. В. Александрова, А. Н. Карпов. – Санкт-Петербург: Санкт-Петербургский политехнический университет Петра Великого, 2016. – 76 с. – ISBN 978-5-7422-5424-9. – EDN WQSZAN.</w:t>
+      </w:r>
+    </w:p>
+    <w:p>
+      <w:pPr>
+        <w:spacing w:line="360" w:lineRule="auto" w:after="120"/>
+        <w:ind w:firstLine="709"/>
+        <w:jc w:val="both"/>
+      </w:pPr>
+      <w:r>
+        <w:rPr>
+          <w:rFonts w:ascii="Times New Roman" w:hAnsi="Times New Roman"/>
+          <w:sz w:val="28"/>
+        </w:rPr>
+        <w:t>6. Дударов, С. П. Разработка программного обеспечения с использованием современных языков и сред программирования: учебное пособие / С. П. Дударов; М-во образования и науки Российской Федерации, Российский химико-технологический ун-т им. Д. И. Менделеева. – Москва: РХТУ им. Д. И. Менделеева, 2008. – 111 с. – ISBN 978-5-7237-0681-1. – EDN QMSSZF.</w:t>
+      </w:r>
+    </w:p>
+    <w:p>
+      <w:pPr>
+        <w:pStyle w:val="1"/>
+        <w:spacing w:before="240" w:after="160"/>
+      </w:pPr>
+      <w:r>
+        <w:rPr>
+          <w:rFonts w:ascii="Times New Roman" w:hAnsi="Times New Roman"/>
+          <w:b/>
+          <w:color w:val="000000"/>
+          <w:sz w:val="30"/>
+        </w:rPr>
+        <w:t>9. Перечень ресурсов информационно-телекоммуникационной сети «Интернет», необходимых для освоения дисциплины</w:t>
+      </w:r>
+    </w:p>
+    <w:p>
+      <w:pPr>
+        <w:spacing w:line="360" w:lineRule="auto" w:after="120"/>
+        <w:ind w:firstLine="709"/>
+        <w:jc w:val="both"/>
+      </w:pPr>
+      <w:r>
+        <w:rPr>
+          <w:rFonts w:ascii="Times New Roman" w:hAnsi="Times New Roman"/>
+          <w:sz w:val="28"/>
+        </w:rPr>
+        <w:t>1. Электронно-библиотечная система BOOK.RU — http://www.book.ru</w:t>
+      </w:r>
+    </w:p>
+    <w:p>
+      <w:pPr>
+        <w:spacing w:line="360" w:lineRule="auto" w:after="120"/>
+        <w:ind w:firstLine="709"/>
+        <w:jc w:val="both"/>
+      </w:pPr>
+      <w:r>
+        <w:rPr>
+          <w:rFonts w:ascii="Times New Roman" w:hAnsi="Times New Roman"/>
+          <w:sz w:val="28"/>
+        </w:rPr>
+        <w:t>2. Электронно-библиотечная система «Университетская библиотека ОНЛАЙН» — http://biblioclub.ru/</w:t>
+      </w:r>
+    </w:p>
+    <w:p>
+      <w:pPr>
+        <w:spacing w:line="360" w:lineRule="auto" w:after="120"/>
+        <w:ind w:firstLine="709"/>
+        <w:jc w:val="both"/>
+      </w:pPr>
+      <w:r>
+        <w:rPr>
+          <w:rFonts w:ascii="Times New Roman" w:hAnsi="Times New Roman"/>
+          <w:sz w:val="28"/>
+        </w:rPr>
+        <w:t>3. Электронно-библиотечная система Znanium — http://www.znanium.com</w:t>
+      </w:r>
+    </w:p>
+    <w:p>
+      <w:pPr>
+        <w:spacing w:line="360" w:lineRule="auto" w:after="120"/>
+        <w:ind w:firstLine="709"/>
+        <w:jc w:val="both"/>
+      </w:pPr>
+      <w:r>
+        <w:rPr>
+          <w:rFonts w:ascii="Times New Roman" w:hAnsi="Times New Roman"/>
+          <w:sz w:val="28"/>
+        </w:rPr>
+        <w:t>4. Электронно-библиотечная система издательства «ЮРАЙТ» — https://urait.ru/</w:t>
+      </w:r>
+    </w:p>
+    <w:p>
+      <w:pPr>
+        <w:spacing w:line="360" w:lineRule="auto" w:after="120"/>
+        <w:ind w:firstLine="709"/>
+        <w:jc w:val="both"/>
+      </w:pPr>
+      <w:r>
+        <w:rPr>
+          <w:rFonts w:ascii="Times New Roman" w:hAnsi="Times New Roman"/>
+          <w:sz w:val="28"/>
+        </w:rPr>
+        <w:t>5. Электронно-библиотечная система издательства «Проспект» — http://ebs.prospekt.org/books</w:t>
+      </w:r>
+    </w:p>
+    <w:p>
+      <w:pPr>
+        <w:spacing w:line="360" w:lineRule="auto" w:after="120"/>
+        <w:ind w:firstLine="709"/>
+        <w:jc w:val="both"/>
+      </w:pPr>
+      <w:r>
+        <w:rPr>
+          <w:rFonts w:ascii="Times New Roman" w:hAnsi="Times New Roman"/>
+          <w:sz w:val="28"/>
+        </w:rPr>
+        <w:t>6. Электронно-библиотечная система издательства «Лань» — https://e.lanbook.com/</w:t>
+      </w:r>
+    </w:p>
+    <w:p>
+      <w:pPr>
+        <w:spacing w:line="360" w:lineRule="auto" w:after="120"/>
+        <w:ind w:firstLine="709"/>
+        <w:jc w:val="both"/>
+      </w:pPr>
+      <w:r>
+        <w:rPr>
+          <w:rFonts w:ascii="Times New Roman" w:hAnsi="Times New Roman"/>
+          <w:sz w:val="28"/>
+        </w:rPr>
+        <w:t>7. Электронная библиотека Издательского дома «Гребенников» — https://grebennikon.ru/</w:t>
+      </w:r>
+    </w:p>
+    <w:p>
+      <w:pPr>
+        <w:spacing w:line="360" w:lineRule="auto" w:after="120"/>
+        <w:ind w:firstLine="709"/>
+        <w:jc w:val="both"/>
+      </w:pPr>
+      <w:r>
+        <w:rPr>
+          <w:rFonts w:ascii="Times New Roman" w:hAnsi="Times New Roman"/>
+          <w:sz w:val="28"/>
+        </w:rPr>
+        <w:t>8. Деловая онлайн-библиотека Alpina Digital — http://lib.alpinadigital.ru/</w:t>
+      </w:r>
+    </w:p>
+    <w:p>
+      <w:pPr>
+        <w:spacing w:line="360" w:lineRule="auto" w:after="120"/>
+        <w:ind w:firstLine="709"/>
+        <w:jc w:val="both"/>
+      </w:pPr>
+      <w:r>
+        <w:rPr>
+          <w:rFonts w:ascii="Times New Roman" w:hAnsi="Times New Roman"/>
+          <w:sz w:val="28"/>
+        </w:rPr>
+        <w:t>9. Научная электронная библиотека eLibrary.ru — http://elibrary.ru</w:t>
+      </w:r>
+    </w:p>
+    <w:p>
+      <w:pPr>
+        <w:spacing w:line="360" w:lineRule="auto" w:after="120"/>
+        <w:ind w:firstLine="709"/>
+        <w:jc w:val="both"/>
+      </w:pPr>
+      <w:r>
+        <w:rPr>
+          <w:rFonts w:ascii="Times New Roman" w:hAnsi="Times New Roman"/>
+          <w:sz w:val="28"/>
+        </w:rPr>
+        <w:t>10. Национальная электронная библиотека — http://нэб.рф/</w:t>
+      </w:r>
+    </w:p>
+    <w:p>
+      <w:pPr>
+        <w:spacing w:line="360" w:lineRule="auto" w:after="120"/>
+        <w:ind w:firstLine="709"/>
+        <w:jc w:val="both"/>
+      </w:pPr>
+      <w:r>
+        <w:rPr>
+          <w:rFonts w:ascii="Times New Roman" w:hAnsi="Times New Roman"/>
+          <w:sz w:val="28"/>
+        </w:rPr>
+        <w:t>11. СПАРК — https://spark-interfax.ru/</w:t>
+      </w:r>
+    </w:p>
+    <w:p>
+      <w:pPr>
+        <w:pStyle w:val="1"/>
+        <w:spacing w:before="240" w:after="160"/>
+      </w:pPr>
+      <w:r>
+        <w:rPr>
+          <w:rFonts w:ascii="Times New Roman" w:hAnsi="Times New Roman"/>
+          <w:b/>
+          <w:color w:val="000000"/>
+          <w:sz w:val="30"/>
+        </w:rPr>
+        <w:t>10. Методические указания для обучающихся по освоению дисциплины</w:t>
+      </w:r>
+    </w:p>
+    <w:p>
+      <w:pPr>
+        <w:spacing w:line="360" w:lineRule="auto" w:after="120"/>
+        <w:ind w:firstLine="709"/>
+        <w:jc w:val="both"/>
+      </w:pPr>
+      <w:r>
+        <w:rPr>
+          <w:rFonts w:ascii="Times New Roman" w:hAnsi="Times New Roman"/>
+          <w:sz w:val="28"/>
+        </w:rPr>
+        <w:t>Основные этапы работы студента по дисциплине «Технологии разработки программного обеспечения»:</w:t>
+      </w:r>
+    </w:p>
+    <w:p>
+      <w:pPr>
+        <w:spacing w:line="360" w:lineRule="auto" w:after="120"/>
+        <w:ind w:firstLine="709"/>
+        <w:jc w:val="both"/>
+      </w:pPr>
+      <w:r>
+        <w:rPr>
+          <w:rFonts w:ascii="Times New Roman" w:hAnsi="Times New Roman"/>
+          <w:sz w:val="28"/>
+        </w:rPr>
+        <w:t>1) предварительная ориентировка в подлежащем изучению учебном материале по программе;</w:t>
+      </w:r>
+    </w:p>
+    <w:p>
+      <w:pPr>
+        <w:spacing w:line="360" w:lineRule="auto" w:after="120"/>
+        <w:ind w:firstLine="709"/>
+        <w:jc w:val="both"/>
+      </w:pPr>
+      <w:r>
+        <w:rPr>
+          <w:rFonts w:ascii="Times New Roman" w:hAnsi="Times New Roman"/>
+          <w:sz w:val="28"/>
+        </w:rPr>
+        <w:t>2) ознакомление с рекомендованной учебной литературой;</w:t>
+      </w:r>
+    </w:p>
+    <w:p>
+      <w:pPr>
+        <w:spacing w:line="360" w:lineRule="auto" w:after="120"/>
+        <w:ind w:firstLine="709"/>
+        <w:jc w:val="both"/>
+      </w:pPr>
+      <w:r>
+        <w:rPr>
+          <w:rFonts w:ascii="Times New Roman" w:hAnsi="Times New Roman"/>
+          <w:sz w:val="28"/>
+        </w:rPr>
+        <w:t>3) слушание и конспектирование лекций, а также выполнение других видов учебной работы;</w:t>
+      </w:r>
+    </w:p>
+    <w:p>
+      <w:pPr>
+        <w:spacing w:line="360" w:lineRule="auto" w:after="120"/>
+        <w:ind w:firstLine="709"/>
+        <w:jc w:val="both"/>
+      </w:pPr>
+      <w:r>
+        <w:rPr>
+          <w:rFonts w:ascii="Times New Roman" w:hAnsi="Times New Roman"/>
+          <w:sz w:val="28"/>
+        </w:rPr>
+        <w:t>4) планирование самостоятельной работы, в том числе командной работы над проектом между спринт-ревью;</w:t>
+      </w:r>
+    </w:p>
+    <w:p>
+      <w:pPr>
+        <w:spacing w:line="360" w:lineRule="auto" w:after="120"/>
+        <w:ind w:firstLine="709"/>
+        <w:jc w:val="both"/>
+      </w:pPr>
+      <w:r>
+        <w:rPr>
+          <w:rFonts w:ascii="Times New Roman" w:hAnsi="Times New Roman"/>
+          <w:sz w:val="28"/>
+        </w:rPr>
+        <w:t>5) обобщение и систематизация информации, почерпнутой из лекций, прочитанной литературы и практики выполнения командного проекта.</w:t>
+      </w:r>
+    </w:p>
+    <w:p>
+      <w:pPr>
+        <w:spacing w:line="360" w:lineRule="auto" w:after="120"/>
+        <w:ind w:firstLine="709"/>
+        <w:jc w:val="both"/>
+      </w:pPr>
+      <w:r>
+        <w:rPr>
+          <w:rFonts w:ascii="Times New Roman" w:hAnsi="Times New Roman"/>
+          <w:sz w:val="28"/>
+        </w:rPr>
+        <w:t>Рекомендации по работе с учебным материалом: осознавайте наличный уровень полученных вами знаний; в ситуации непонимания выявляйте тот первичный уровень и факторы непонимания, которые стали препятствием для понимания последующего материала; задавайте сами себе вопросы и пытайтесь ответить на них.</w:t>
+      </w:r>
+    </w:p>
+    <w:p>
+      <w:pPr>
+        <w:spacing w:line="360" w:lineRule="auto" w:after="120"/>
+        <w:ind w:firstLine="709"/>
+        <w:jc w:val="both"/>
+      </w:pPr>
+      <w:r>
+        <w:rPr>
+          <w:rFonts w:ascii="Times New Roman" w:hAnsi="Times New Roman"/>
+          <w:sz w:val="28"/>
+        </w:rPr>
+        <w:t>Рекомендации по работе на лекции и с лекционным материалом: основная задача на лекции — осмысление излагаемого материала, для этого необходимо слушать лекцию с самого начала, не упуская общих, ориентирующих в материале рассуждений и установок лектора; ведение записей на лекции важно и полезно для лучшего осмысления материала и сохранения информации с целью её дальнейшего использования; для облегчения записи рекомендуется применять сокращения повторяющихся терминов или хорошо известных понятий.</w:t>
+      </w:r>
+    </w:p>
+    <w:p>
+      <w:pPr>
+        <w:spacing w:line="360" w:lineRule="auto" w:after="120"/>
+        <w:ind w:firstLine="709"/>
+        <w:jc w:val="both"/>
+      </w:pPr>
+      <w:r>
+        <w:rPr>
+          <w:rFonts w:ascii="Times New Roman" w:hAnsi="Times New Roman"/>
+          <w:sz w:val="28"/>
+        </w:rPr>
+        <w:t>Рекомендации по работе с литературой: при затруднениях в поиске материала по конкретному вопросу следует обратиться к предметному указателю, напечатанному, как правило, в конце литературного источника. Предметный указатель — это алфавитный список основных научных понятий (терминов), содержание которых раскрыто в книге; рядом с термином стоят номера страниц, на которых изложен относящийся к данному понятию материал.</w:t>
+      </w:r>
+    </w:p>
+    <w:p>
+      <w:pPr>
+        <w:pStyle w:val="1"/>
+        <w:spacing w:before="240" w:after="160"/>
+      </w:pPr>
+      <w:r>
+        <w:rPr>
+          <w:rFonts w:ascii="Times New Roman" w:hAnsi="Times New Roman"/>
+          <w:b/>
+          <w:color w:val="000000"/>
+          <w:sz w:val="30"/>
+        </w:rPr>
+        <w:t>11. Перечень информационных технологий, используемых при осуществлении образовательного процесса по дисциплине, включая перечень необходимого программного обеспечения и информационных справочных систем</w:t>
+      </w:r>
+    </w:p>
+    <w:p>
+      <w:pPr>
+        <w:spacing w:line="360" w:lineRule="auto" w:after="120"/>
+        <w:ind w:firstLine="709"/>
+        <w:jc w:val="both"/>
+      </w:pPr>
+      <w:r>
+        <w:rPr>
+          <w:rFonts w:ascii="Times New Roman" w:hAnsi="Times New Roman"/>
+          <w:sz w:val="28"/>
+        </w:rPr>
+        <w:t>1. Комплект лицензионного программного обеспечения: пакет офисных программ; антивирус Kaspersky.</w:t>
+      </w:r>
+    </w:p>
+    <w:p>
+      <w:pPr>
+        <w:spacing w:line="360" w:lineRule="auto" w:after="120"/>
+        <w:ind w:firstLine="709"/>
+        <w:jc w:val="both"/>
+      </w:pPr>
+      <w:r>
+        <w:rPr>
+          <w:rFonts w:ascii="Times New Roman" w:hAnsi="Times New Roman"/>
+          <w:sz w:val="28"/>
+        </w:rPr>
+        <w:t>2. Современные профессиональные базы данных и информационные справочные системы: информационно-правовая система «Гарант»; информационно-правовая система «КонсультантПлюс»; электронная энциклопедия — http://ru.wikipedia.org/wiki/Wiki; система комплексного раскрытия информации «СКРИН» — http://www.skrin.ru/.</w:t>
+      </w:r>
+    </w:p>
+    <w:p>
+      <w:pPr>
+        <w:spacing w:line="360" w:lineRule="auto" w:after="120"/>
+        <w:ind w:firstLine="709"/>
+        <w:jc w:val="both"/>
+      </w:pPr>
+      <w:r>
+        <w:rPr>
+          <w:rFonts w:ascii="Times New Roman" w:hAnsi="Times New Roman"/>
+          <w:sz w:val="28"/>
+        </w:rPr>
+        <w:t>3. Сертифицированные программные и аппаратные средства защиты информации — не используются.</w:t>
+      </w:r>
+    </w:p>
+    <w:p>
+      <w:pPr>
+        <w:spacing w:line="360" w:lineRule="auto" w:after="120"/>
+        <w:ind w:firstLine="709"/>
+        <w:jc w:val="both"/>
+      </w:pPr>
+      <w:r>
+        <w:rPr>
+          <w:rFonts w:ascii="Times New Roman" w:hAnsi="Times New Roman"/>
+          <w:sz w:val="28"/>
+        </w:rPr>
+        <w:t>4. Python 3.</w:t>
+      </w:r>
+    </w:p>
+    <w:p>
+      <w:pPr>
+        <w:spacing w:line="360" w:lineRule="auto" w:after="120"/>
+        <w:ind w:firstLine="709"/>
+        <w:jc w:val="both"/>
+      </w:pPr>
+      <w:r>
+        <w:rPr>
+          <w:rFonts w:ascii="Times New Roman" w:hAnsi="Times New Roman"/>
+          <w:sz w:val="28"/>
+        </w:rPr>
+        <w:t>5. StarUML.</w:t>
+      </w:r>
+    </w:p>
+    <w:p>
+      <w:pPr>
+        <w:spacing w:line="360" w:lineRule="auto" w:after="120"/>
+        <w:ind w:firstLine="709"/>
+        <w:jc w:val="both"/>
+      </w:pPr>
+      <w:r>
+        <w:rPr>
+          <w:rFonts w:ascii="Times New Roman" w:hAnsi="Times New Roman"/>
+          <w:sz w:val="28"/>
+        </w:rPr>
+        <w:t>6. Система контроля версий Git и веб-сервис хостинга репозиториев (используются для командного проекта, код-ревью и автоматических проверок).</w:t>
+      </w:r>
+    </w:p>
+    <w:p>
+      <w:pPr>
+        <w:pStyle w:val="1"/>
+        <w:spacing w:before="240" w:after="160"/>
+      </w:pPr>
+      <w:r>
+        <w:rPr>
+          <w:rFonts w:ascii="Times New Roman" w:hAnsi="Times New Roman"/>
+          <w:b/>
+          <w:color w:val="000000"/>
+          <w:sz w:val="30"/>
+        </w:rPr>
+        <w:t>12. Описание материально-технической базы, необходимой для осуществления образовательного процесса по дисциплине</w:t>
+      </w:r>
+    </w:p>
+    <w:p>
+      <w:pPr>
+        <w:spacing w:line="360" w:lineRule="auto" w:after="120"/>
+        <w:ind w:firstLine="709"/>
+        <w:jc w:val="both"/>
+      </w:pPr>
+      <w:r>
+        <w:rPr>
+          <w:rFonts w:ascii="Times New Roman" w:hAnsi="Times New Roman"/>
+          <w:sz w:val="28"/>
+        </w:rPr>
+        <w:t>Лекционные занятия проводятся в мультимедийных аудиториях, а лабораторные занятия — в компьютерных классах с доступом к сети «Интернет» и установленным программным обеспечением из перечня раздела 11.</w:t>
       </w:r>
     </w:p>
     <w:sectPr>

</xml_diff>